<commit_message>
id number added to new file in new branch
</commit_message>
<xml_diff>
--- a/MAHADI HASAN.docx
+++ b/MAHADI HASAN.docx
@@ -8,6 +8,14 @@
       </w:pPr>
       <w:r>
         <w:t>MAHADI HASAN JONY</w:t>
+      </w:r>
+    </w:p>
+    <w:p>
+      <w:pPr>
+        <w:jc w:val="center"/>
+      </w:pPr>
+      <w:r>
+        <w:t>Id- 23-50468-1</w:t>
       </w:r>
     </w:p>
     <w:p>

</xml_diff>